<commit_message>
Restore four-column table format for revised business rules
</commit_message>
<xml_diff>
--- a/docs/Final_Revised_Business_Rules.docx
+++ b/docs/Final_Revised_Business_Rules.docx
@@ -14,255 +14,1162 @@
     </w:p>
     <w:p>
       <w:r>
-        <w:rPr>
-          <w:sz w:val="20"/>
-        </w:rPr>
-        <w:t>Revised 29 October 2026</w:t>
+        <w:t>Revised 29 October 2026. “Backend” identifies validation performed by the application rather than solely by the database.</w:t>
       </w:r>
     </w:p>
-    <w:p>
-      <w:pPr>
-        <w:widowControl/>
-      </w:pPr>
-      <w:r>
-        <w:rPr>
-          <w:b/>
-        </w:rPr>
-        <w:t xml:space="preserve">1. </w:t>
-      </w:r>
-      <w:r>
-        <w:t>Every student, teacher and admin must have their own account with a unique ID. Two accounts of the same role must not share an email, and passwords must never be stored in plain form.</w:t>
-      </w:r>
-    </w:p>
-    <w:p>
-      <w:pPr>
-        <w:widowControl/>
-      </w:pPr>
-      <w:r>
-        <w:rPr>
-          <w:b/>
-        </w:rPr>
-        <w:t xml:space="preserve">2. </w:t>
-      </w:r>
-      <w:r>
-        <w:t>A student or teacher account that has protected related records, such as enrollments, assigned classes, reviewer references or audit entries, must not be deleted. These accounts may be deactivated to restrict access while preserving their records. Only an account with no blocking related records may be deleted, and only by an admin.</w:t>
-      </w:r>
-    </w:p>
-    <w:p>
-      <w:pPr>
-        <w:widowControl/>
-      </w:pPr>
-      <w:r>
-        <w:rPr>
-          <w:b/>
-        </w:rPr>
-        <w:t xml:space="preserve">3. </w:t>
-      </w:r>
-      <w:r>
-        <w:t>A course may be offered in many classes. A course that has classes must not be deleted.</w:t>
-      </w:r>
-    </w:p>
-    <w:p>
-      <w:pPr>
-        <w:widowControl/>
-      </w:pPr>
-      <w:r>
-        <w:rPr>
-          <w:b/>
-        </w:rPr>
-        <w:t xml:space="preserve">4. </w:t>
-      </w:r>
-      <w:r>
-        <w:t>Every class is one offering of a course for a section, semester and academic year, and must have exactly one teacher. The same offering must not be created twice. A teacher may handle many classes.</w:t>
-      </w:r>
-    </w:p>
-    <w:p>
-      <w:pPr>
-        <w:widowControl/>
-      </w:pPr>
-      <w:r>
-        <w:rPr>
-          <w:b/>
-        </w:rPr>
-        <w:t xml:space="preserve">5. </w:t>
-      </w:r>
-      <w:r>
-        <w:t>A student may enroll in many classes, and a class may have many students. A student must not be enrolled in the same class twice.</w:t>
-      </w:r>
-    </w:p>
-    <w:p>
-      <w:pPr>
-        <w:widowControl/>
-      </w:pPr>
-      <w:r>
-        <w:rPr>
-          <w:b/>
-        </w:rPr>
-        <w:t xml:space="preserve">6. </w:t>
-      </w:r>
-      <w:r>
-        <w:t>Every assessment must belong to one class and one term (Midterm or Finals), and must have a type, a maximum score above zero and a weight.</w:t>
-      </w:r>
-    </w:p>
-    <w:p>
-      <w:pPr>
-        <w:widowControl/>
-      </w:pPr>
-      <w:r>
-        <w:rPr>
-          <w:b/>
-        </w:rPr>
-        <w:t xml:space="preserve">7. </w:t>
-      </w:r>
-      <w:r>
-        <w:t>A student must have no more than one grade for each assessment.</w:t>
-      </w:r>
-    </w:p>
-    <w:p>
-      <w:pPr>
-        <w:widowControl/>
-      </w:pPr>
-      <w:r>
-        <w:rPr>
-          <w:b/>
-        </w:rPr>
-        <w:t xml:space="preserve">8. </w:t>
-      </w:r>
-      <w:r>
-        <w:t>A score stays blank until the assessment is graded. A score must not be negative, must not exceed the assessment’s maximum, must have at most two decimal places, and may be recorded only for an assessment in the student’s own class.</w:t>
-      </w:r>
-    </w:p>
-    <w:p>
-      <w:pPr>
-        <w:widowControl/>
-      </w:pPr>
-      <w:r>
-        <w:rPr>
-          <w:b/>
-        </w:rPr>
-        <w:t xml:space="preserve">9. </w:t>
-      </w:r>
-      <w:r>
-        <w:t>A student’s running grade must count only the assessments already graded, weighted in proportion to each other. Weights need not total 100 and terms need not be split 50/50.</w:t>
-      </w:r>
-    </w:p>
-    <w:p>
-      <w:pPr>
-        <w:widowControl/>
-      </w:pPr>
-      <w:r>
-        <w:rPr>
-          <w:b/>
-        </w:rPr>
-        <w:t xml:space="preserve">10. </w:t>
-      </w:r>
-      <w:r>
-        <w:t>A student is Passed at a running grade of 75% or higher and At risk below 75%. Until something is graded, the student is Not Yet.</w:t>
-      </w:r>
-    </w:p>
-    <w:p>
-      <w:pPr>
-        <w:widowControl/>
-      </w:pPr>
-      <w:r>
-        <w:rPr>
-          <w:b/>
-        </w:rPr>
-        <w:t xml:space="preserve">11. </w:t>
-      </w:r>
-      <w:r>
-        <w:t>A student may ask for a re-check or a point increase only on their own graded assessment. A grade may have only one open request at a time.</w:t>
-      </w:r>
-    </w:p>
-    <w:p>
-      <w:pPr>
-        <w:widowControl/>
-      </w:pPr>
-      <w:r>
-        <w:rPr>
-          <w:b/>
-        </w:rPr>
-        <w:t xml:space="preserve">12. </w:t>
-      </w:r>
-      <w:r>
-        <w:t>A new request starts as Pending. Only the class’s assigned active teacher may mark it Under Review, approve it or close it. Under Review is optional. The reviewer and review time must be recorded when the request is Approved or Closed. Marking a request Under Review must be recorded in the audit log but does not set the reviewer and review-time fields. A request that is Approved or Closed must not be processed again.</w:t>
-      </w:r>
-    </w:p>
-    <w:p>
-      <w:pPr>
-        <w:widowControl/>
-      </w:pPr>
-      <w:r>
-        <w:rPr>
-          <w:b/>
-        </w:rPr>
-        <w:t xml:space="preserve">13. </w:t>
-      </w:r>
-      <w:r>
-        <w:t>Only an active teacher assigned to a class may record scores and decide revision requests for it. Authorized admins may also record scores, but request decisions stay with the assigned teacher.</w:t>
-      </w:r>
-    </w:p>
-    <w:p>
-      <w:pPr>
-        <w:widowControl/>
-      </w:pPr>
-      <w:r>
-        <w:rPr>
-          <w:b/>
-        </w:rPr>
-        <w:t xml:space="preserve">14. </w:t>
-      </w:r>
-      <w:r>
-        <w:t>Every important action must be logged with who did it (exactly one person: a student, teacher or admin), and with the old and new values when a score changes.</w:t>
-      </w:r>
-    </w:p>
-    <w:p>
-      <w:pPr>
-        <w:widowControl/>
-      </w:pPr>
-      <w:r>
-        <w:rPr>
-          <w:b/>
-        </w:rPr>
-        <w:t xml:space="preserve">15. </w:t>
-      </w:r>
-      <w:r>
-        <w:t>The history of an action must be kept even after the record it refers to is deleted.</w:t>
-      </w:r>
-    </w:p>
-    <w:p>
-      <w:pPr>
-        <w:widowControl/>
-      </w:pPr>
-      <w:r>
-        <w:rPr>
-          <w:b/>
-        </w:rPr>
-        <w:t xml:space="preserve">16. </w:t>
-      </w:r>
-      <w:r>
-        <w:t>A teacher or course with classes, a student or class with enrollments, or an account referenced as an audit actor must not be deleted while those protected references remain. Where deletion is permitted, related records must follow the database’s defined deletion rules. Deleting an enrollment or assessment must also remove its related grades and the revision requests associated with those grades.</w:t>
-      </w:r>
-    </w:p>
-    <w:p>
-      <w:pPr>
-        <w:widowControl/>
-      </w:pPr>
-      <w:r>
-        <w:rPr>
-          <w:b/>
-        </w:rPr>
-        <w:t xml:space="preserve">17. </w:t>
-      </w:r>
-      <w:r>
-        <w:t>Each user may see and do only what their role allows: students see their own grades and requests, teachers see their assigned classes, and admins manage accounts. Role, ownership and account status must be checked before any protected action.</w:t>
-      </w:r>
-    </w:p>
+    <w:tbl>
+      <w:tblPr>
+        <w:tblStyle w:val="TableGrid"/>
+        <w:tblW w:type="auto" w:w="0"/>
+        <w:tblLayout w:type="fixed"/>
+        <w:tblLook w:firstColumn="1" w:firstRow="1" w:lastColumn="0" w:lastRow="0" w:noHBand="0" w:noVBand="1" w:val="04A0"/>
+      </w:tblPr>
+      <w:tblGrid>
+        <w:gridCol w:w="720"/>
+        <w:gridCol w:w="3600"/>
+        <w:gridCol w:w="2448"/>
+        <w:gridCol w:w="3557"/>
+      </w:tblGrid>
+      <w:tr>
+        <w:trPr>
+          <w:tblHeader/>
+        </w:trPr>
+        <w:tc>
+          <w:tcPr>
+            <w:tcW w:type="dxa" w:w="720"/>
+            <w:shd w:fill="006400"/>
+          </w:tcPr>
+          <w:p>
+            <w:r>
+              <w:rPr>
+                <w:b/>
+                <w:color w:val="FFFFFF"/>
+              </w:rPr>
+              <w:t>Rule No.</w:t>
+            </w:r>
+          </w:p>
+        </w:tc>
+        <w:tc>
+          <w:tcPr>
+            <w:tcW w:type="dxa" w:w="3600"/>
+            <w:shd w:fill="006400"/>
+          </w:tcPr>
+          <w:p>
+            <w:r>
+              <w:rPr>
+                <w:b/>
+                <w:color w:val="FFFFFF"/>
+              </w:rPr>
+              <w:t>Business Rule</w:t>
+            </w:r>
+          </w:p>
+        </w:tc>
+        <w:tc>
+          <w:tcPr>
+            <w:tcW w:type="dxa" w:w="2448"/>
+            <w:shd w:fill="006400"/>
+          </w:tcPr>
+          <w:p>
+            <w:r>
+              <w:rPr>
+                <w:b/>
+                <w:color w:val="FFFFFF"/>
+              </w:rPr>
+              <w:t>Database/Relationship Impact</w:t>
+            </w:r>
+          </w:p>
+        </w:tc>
+        <w:tc>
+          <w:tcPr>
+            <w:tcW w:type="dxa" w:w="3557"/>
+            <w:shd w:fill="006400"/>
+          </w:tcPr>
+          <w:p>
+            <w:r>
+              <w:rPr>
+                <w:b/>
+                <w:color w:val="FFFFFF"/>
+              </w:rPr>
+              <w:t>Validation/Constraint</w:t>
+            </w:r>
+          </w:p>
+        </w:tc>
+      </w:tr>
+      <w:tr>
+        <w:trPr>
+          <w:cantSplit/>
+        </w:trPr>
+        <w:tc>
+          <w:tcPr>
+            <w:tcW w:type="dxa" w:w="720"/>
+            <w:vAlign w:val="top"/>
+          </w:tcPr>
+          <w:p>
+            <w:pPr>
+              <w:spacing w:after="100" w:before="60" w:line="247" w:lineRule="auto"/>
+            </w:pPr>
+            <w:r>
+              <w:t>1</w:t>
+            </w:r>
+          </w:p>
+        </w:tc>
+        <w:tc>
+          <w:tcPr>
+            <w:tcW w:type="dxa" w:w="3600"/>
+            <w:vAlign w:val="top"/>
+          </w:tcPr>
+          <w:p>
+            <w:pPr>
+              <w:spacing w:after="100" w:before="60" w:line="247" w:lineRule="auto"/>
+            </w:pPr>
+            <w:r>
+              <w:t>Every student, teacher and admin must have their own account with a unique ID. Two accounts of the same role must not share an email, and passwords must never be stored in plain form.</w:t>
+            </w:r>
+          </w:p>
+        </w:tc>
+        <w:tc>
+          <w:tcPr>
+            <w:tcW w:type="dxa" w:w="2448"/>
+            <w:vAlign w:val="top"/>
+          </w:tcPr>
+          <w:p>
+            <w:pPr>
+              <w:spacing w:after="100" w:before="60" w:line="247" w:lineRule="auto"/>
+            </w:pPr>
+            <w:r>
+              <w:t>Separate Student, Teacher and Admin tables.</w:t>
+            </w:r>
+          </w:p>
+        </w:tc>
+        <w:tc>
+          <w:tcPr>
+            <w:tcW w:type="dxa" w:w="3557"/>
+            <w:vAlign w:val="top"/>
+          </w:tcPr>
+          <w:p>
+            <w:pPr>
+              <w:spacing w:after="100" w:before="60" w:line="247" w:lineRule="auto"/>
+            </w:pPr>
+            <w:r>
+              <w:t>PRIMARY KEY on each account ID. UNIQUE email within each role table. NOT NULL password_hash. Backend: password hashing.</w:t>
+            </w:r>
+          </w:p>
+        </w:tc>
+      </w:tr>
+      <w:tr>
+        <w:trPr>
+          <w:cantSplit/>
+        </w:trPr>
+        <w:tc>
+          <w:tcPr>
+            <w:tcW w:type="dxa" w:w="720"/>
+            <w:vAlign w:val="top"/>
+            <w:shd w:fill="F0F7F1"/>
+          </w:tcPr>
+          <w:p>
+            <w:pPr>
+              <w:spacing w:after="100" w:before="60" w:line="247" w:lineRule="auto"/>
+            </w:pPr>
+            <w:r>
+              <w:t>2</w:t>
+            </w:r>
+          </w:p>
+        </w:tc>
+        <w:tc>
+          <w:tcPr>
+            <w:tcW w:type="dxa" w:w="3600"/>
+            <w:vAlign w:val="top"/>
+            <w:shd w:fill="F0F7F1"/>
+          </w:tcPr>
+          <w:p>
+            <w:pPr>
+              <w:spacing w:after="100" w:before="60" w:line="247" w:lineRule="auto"/>
+            </w:pPr>
+            <w:r>
+              <w:t>A student or teacher account that has protected related records, such as enrollments, assigned classes, reviewer references or audit entries, must not be deleted. These accounts may be deactivated to restrict access while preserving their records. Only an account with no blocking related records may be deleted, and only by an admin.</w:t>
+            </w:r>
+          </w:p>
+        </w:tc>
+        <w:tc>
+          <w:tcPr>
+            <w:tcW w:type="dxa" w:w="2448"/>
+            <w:vAlign w:val="top"/>
+            <w:shd w:fill="F0F7F1"/>
+          </w:tcPr>
+          <w:p>
+            <w:pPr>
+              <w:spacing w:after="100" w:before="60" w:line="247" w:lineRule="auto"/>
+            </w:pPr>
+            <w:r>
+              <w:t>status on Student and Teacher. Account deletion depends on protected related records.</w:t>
+            </w:r>
+          </w:p>
+        </w:tc>
+        <w:tc>
+          <w:tcPr>
+            <w:tcW w:type="dxa" w:w="3557"/>
+            <w:vAlign w:val="top"/>
+            <w:shd w:fill="F0F7F1"/>
+          </w:tcPr>
+          <w:p>
+            <w:pPr>
+              <w:spacing w:after="100" w:before="60" w:line="247" w:lineRule="auto"/>
+            </w:pPr>
+            <w:r>
+              <w:t>status ENUM('Active','Inactive') NOT NULL DEFAULT 'Active'. Restrictive foreign keys protect linked records. Backend: admin authorization and linked-record checks, including reviewer references.</w:t>
+            </w:r>
+          </w:p>
+        </w:tc>
+      </w:tr>
+      <w:tr>
+        <w:trPr>
+          <w:cantSplit/>
+        </w:trPr>
+        <w:tc>
+          <w:tcPr>
+            <w:tcW w:type="dxa" w:w="720"/>
+            <w:vAlign w:val="top"/>
+          </w:tcPr>
+          <w:p>
+            <w:pPr>
+              <w:spacing w:after="100" w:before="60" w:line="247" w:lineRule="auto"/>
+            </w:pPr>
+            <w:r>
+              <w:t>3</w:t>
+            </w:r>
+          </w:p>
+        </w:tc>
+        <w:tc>
+          <w:tcPr>
+            <w:tcW w:type="dxa" w:w="3600"/>
+            <w:vAlign w:val="top"/>
+          </w:tcPr>
+          <w:p>
+            <w:pPr>
+              <w:spacing w:after="100" w:before="60" w:line="247" w:lineRule="auto"/>
+            </w:pPr>
+            <w:r>
+              <w:t>A course may be offered in many classes. A course that has classes must not be deleted.</w:t>
+            </w:r>
+          </w:p>
+        </w:tc>
+        <w:tc>
+          <w:tcPr>
+            <w:tcW w:type="dxa" w:w="2448"/>
+            <w:vAlign w:val="top"/>
+          </w:tcPr>
+          <w:p>
+            <w:pPr>
+              <w:spacing w:after="100" w:before="60" w:line="247" w:lineRule="auto"/>
+            </w:pPr>
+            <w:r>
+              <w:t>Course 1 to many Class.</w:t>
+            </w:r>
+          </w:p>
+        </w:tc>
+        <w:tc>
+          <w:tcPr>
+            <w:tcW w:type="dxa" w:w="3557"/>
+            <w:vAlign w:val="top"/>
+          </w:tcPr>
+          <w:p>
+            <w:pPr>
+              <w:spacing w:after="100" w:before="60" w:line="247" w:lineRule="auto"/>
+            </w:pPr>
+            <w:r>
+              <w:t>PRIMARY KEY course_code. FOREIGN KEY Class.course_code, ON DELETE RESTRICT.</w:t>
+            </w:r>
+          </w:p>
+        </w:tc>
+      </w:tr>
+      <w:tr>
+        <w:trPr>
+          <w:cantSplit/>
+        </w:trPr>
+        <w:tc>
+          <w:tcPr>
+            <w:tcW w:type="dxa" w:w="720"/>
+            <w:vAlign w:val="top"/>
+            <w:shd w:fill="F0F7F1"/>
+          </w:tcPr>
+          <w:p>
+            <w:pPr>
+              <w:spacing w:after="100" w:before="60" w:line="247" w:lineRule="auto"/>
+            </w:pPr>
+            <w:r>
+              <w:t>4</w:t>
+            </w:r>
+          </w:p>
+        </w:tc>
+        <w:tc>
+          <w:tcPr>
+            <w:tcW w:type="dxa" w:w="3600"/>
+            <w:vAlign w:val="top"/>
+            <w:shd w:fill="F0F7F1"/>
+          </w:tcPr>
+          <w:p>
+            <w:pPr>
+              <w:spacing w:after="100" w:before="60" w:line="247" w:lineRule="auto"/>
+            </w:pPr>
+            <w:r>
+              <w:t>Every class is one offering of a course for a section, semester and academic year, and must have exactly one teacher. The same offering must not be created twice. A teacher may handle many classes.</w:t>
+            </w:r>
+          </w:p>
+        </w:tc>
+        <w:tc>
+          <w:tcPr>
+            <w:tcW w:type="dxa" w:w="2448"/>
+            <w:vAlign w:val="top"/>
+            <w:shd w:fill="F0F7F1"/>
+          </w:tcPr>
+          <w:p>
+            <w:pPr>
+              <w:spacing w:after="100" w:before="60" w:line="247" w:lineRule="auto"/>
+            </w:pPr>
+            <w:r>
+              <w:t>Teacher 1 to many Class.</w:t>
+            </w:r>
+          </w:p>
+        </w:tc>
+        <w:tc>
+          <w:tcPr>
+            <w:tcW w:type="dxa" w:w="3557"/>
+            <w:vAlign w:val="top"/>
+            <w:shd w:fill="F0F7F1"/>
+          </w:tcPr>
+          <w:p>
+            <w:pPr>
+              <w:spacing w:after="100" w:before="60" w:line="247" w:lineRule="auto"/>
+            </w:pPr>
+            <w:r>
+              <w:t>FOREIGN KEY teacher_id NOT NULL. UNIQUE uq_class (course_code, section, semester, academic_year).</w:t>
+            </w:r>
+          </w:p>
+        </w:tc>
+      </w:tr>
+      <w:tr>
+        <w:trPr>
+          <w:cantSplit/>
+        </w:trPr>
+        <w:tc>
+          <w:tcPr>
+            <w:tcW w:type="dxa" w:w="720"/>
+            <w:vAlign w:val="top"/>
+          </w:tcPr>
+          <w:p>
+            <w:pPr>
+              <w:spacing w:after="100" w:before="60" w:line="247" w:lineRule="auto"/>
+            </w:pPr>
+            <w:r>
+              <w:t>5</w:t>
+            </w:r>
+          </w:p>
+        </w:tc>
+        <w:tc>
+          <w:tcPr>
+            <w:tcW w:type="dxa" w:w="3600"/>
+            <w:vAlign w:val="top"/>
+          </w:tcPr>
+          <w:p>
+            <w:pPr>
+              <w:spacing w:after="100" w:before="60" w:line="247" w:lineRule="auto"/>
+            </w:pPr>
+            <w:r>
+              <w:t>A student may enroll in many classes, and a class may have many students. A student must not be enrolled in the same class twice.</w:t>
+            </w:r>
+          </w:p>
+        </w:tc>
+        <w:tc>
+          <w:tcPr>
+            <w:tcW w:type="dxa" w:w="2448"/>
+            <w:vAlign w:val="top"/>
+          </w:tcPr>
+          <w:p>
+            <w:pPr>
+              <w:spacing w:after="100" w:before="60" w:line="247" w:lineRule="auto"/>
+            </w:pPr>
+            <w:r>
+              <w:t>Many-to-many between Student and Class, resolved by Enrollment.</w:t>
+            </w:r>
+          </w:p>
+        </w:tc>
+        <w:tc>
+          <w:tcPr>
+            <w:tcW w:type="dxa" w:w="3557"/>
+            <w:vAlign w:val="top"/>
+          </w:tcPr>
+          <w:p>
+            <w:pPr>
+              <w:spacing w:after="100" w:before="60" w:line="247" w:lineRule="auto"/>
+            </w:pPr>
+            <w:r>
+              <w:t>FOREIGN KEYS student_id and class_id. UNIQUE uq_enrollment (student_id, class_id).</w:t>
+            </w:r>
+          </w:p>
+        </w:tc>
+      </w:tr>
+      <w:tr>
+        <w:trPr>
+          <w:cantSplit/>
+        </w:trPr>
+        <w:tc>
+          <w:tcPr>
+            <w:tcW w:type="dxa" w:w="720"/>
+            <w:vAlign w:val="top"/>
+            <w:shd w:fill="F0F7F1"/>
+          </w:tcPr>
+          <w:p>
+            <w:pPr>
+              <w:spacing w:after="100" w:before="60" w:line="247" w:lineRule="auto"/>
+            </w:pPr>
+            <w:r>
+              <w:t>6</w:t>
+            </w:r>
+          </w:p>
+        </w:tc>
+        <w:tc>
+          <w:tcPr>
+            <w:tcW w:type="dxa" w:w="3600"/>
+            <w:vAlign w:val="top"/>
+            <w:shd w:fill="F0F7F1"/>
+          </w:tcPr>
+          <w:p>
+            <w:pPr>
+              <w:spacing w:after="100" w:before="60" w:line="247" w:lineRule="auto"/>
+            </w:pPr>
+            <w:r>
+              <w:t>Every assessment must belong to one class and one term (Midterm or Finals), and must have a type, a maximum score above zero and a weight.</w:t>
+            </w:r>
+          </w:p>
+        </w:tc>
+        <w:tc>
+          <w:tcPr>
+            <w:tcW w:type="dxa" w:w="2448"/>
+            <w:vAlign w:val="top"/>
+            <w:shd w:fill="F0F7F1"/>
+          </w:tcPr>
+          <w:p>
+            <w:pPr>
+              <w:spacing w:after="100" w:before="60" w:line="247" w:lineRule="auto"/>
+            </w:pPr>
+            <w:r>
+              <w:t>Class 1 to many Assessment.</w:t>
+            </w:r>
+          </w:p>
+        </w:tc>
+        <w:tc>
+          <w:tcPr>
+            <w:tcW w:type="dxa" w:w="3557"/>
+            <w:vAlign w:val="top"/>
+            <w:shd w:fill="F0F7F1"/>
+          </w:tcPr>
+          <w:p>
+            <w:pPr>
+              <w:spacing w:after="100" w:before="60" w:line="247" w:lineRule="auto"/>
+            </w:pPr>
+            <w:r>
+              <w:t>FOREIGN KEY class_id ON DELETE CASCADE. ENUM term and type. CHECK total_score &gt; 0. CHECK weight BETWEEN 0 AND 100. Backend: positive weight and at most two decimal places for maximum score and weight.</w:t>
+            </w:r>
+          </w:p>
+        </w:tc>
+      </w:tr>
+      <w:tr>
+        <w:trPr>
+          <w:cantSplit/>
+        </w:trPr>
+        <w:tc>
+          <w:tcPr>
+            <w:tcW w:type="dxa" w:w="720"/>
+            <w:vAlign w:val="top"/>
+          </w:tcPr>
+          <w:p>
+            <w:pPr>
+              <w:spacing w:after="100" w:before="60" w:line="247" w:lineRule="auto"/>
+            </w:pPr>
+            <w:r>
+              <w:t>7</w:t>
+            </w:r>
+          </w:p>
+        </w:tc>
+        <w:tc>
+          <w:tcPr>
+            <w:tcW w:type="dxa" w:w="3600"/>
+            <w:vAlign w:val="top"/>
+          </w:tcPr>
+          <w:p>
+            <w:pPr>
+              <w:spacing w:after="100" w:before="60" w:line="247" w:lineRule="auto"/>
+            </w:pPr>
+            <w:r>
+              <w:t>A student must have no more than one grade for each assessment.</w:t>
+            </w:r>
+          </w:p>
+        </w:tc>
+        <w:tc>
+          <w:tcPr>
+            <w:tcW w:type="dxa" w:w="2448"/>
+            <w:vAlign w:val="top"/>
+          </w:tcPr>
+          <w:p>
+            <w:pPr>
+              <w:spacing w:after="100" w:before="60" w:line="247" w:lineRule="auto"/>
+            </w:pPr>
+            <w:r>
+              <w:t>Many-to-many between Enrollment and Assessment, resolved by StudentGrade.</w:t>
+            </w:r>
+          </w:p>
+        </w:tc>
+        <w:tc>
+          <w:tcPr>
+            <w:tcW w:type="dxa" w:w="3557"/>
+            <w:vAlign w:val="top"/>
+          </w:tcPr>
+          <w:p>
+            <w:pPr>
+              <w:spacing w:after="100" w:before="60" w:line="247" w:lineRule="auto"/>
+            </w:pPr>
+            <w:r>
+              <w:t>FOREIGN KEYS enrollment_id and assessment_id. UNIQUE uq_grade (enrollment_id, assessment_id).</w:t>
+            </w:r>
+          </w:p>
+        </w:tc>
+      </w:tr>
+      <w:tr>
+        <w:trPr>
+          <w:cantSplit/>
+        </w:trPr>
+        <w:tc>
+          <w:tcPr>
+            <w:tcW w:type="dxa" w:w="720"/>
+            <w:vAlign w:val="top"/>
+            <w:shd w:fill="F0F7F1"/>
+          </w:tcPr>
+          <w:p>
+            <w:pPr>
+              <w:spacing w:after="100" w:before="60" w:line="247" w:lineRule="auto"/>
+            </w:pPr>
+            <w:r>
+              <w:t>8</w:t>
+            </w:r>
+          </w:p>
+        </w:tc>
+        <w:tc>
+          <w:tcPr>
+            <w:tcW w:type="dxa" w:w="3600"/>
+            <w:vAlign w:val="top"/>
+            <w:shd w:fill="F0F7F1"/>
+          </w:tcPr>
+          <w:p>
+            <w:pPr>
+              <w:spacing w:after="100" w:before="60" w:line="247" w:lineRule="auto"/>
+            </w:pPr>
+            <w:r>
+              <w:t>A score stays blank until the assessment is graded. A score must not be negative, must not exceed the assessment’s maximum, must have at most two decimal places, and may be recorded only for an assessment in the student’s own class.</w:t>
+            </w:r>
+          </w:p>
+        </w:tc>
+        <w:tc>
+          <w:tcPr>
+            <w:tcW w:type="dxa" w:w="2448"/>
+            <w:vAlign w:val="top"/>
+            <w:shd w:fill="F0F7F1"/>
+          </w:tcPr>
+          <w:p>
+            <w:pPr>
+              <w:spacing w:after="100" w:before="60" w:line="247" w:lineRule="auto"/>
+            </w:pPr>
+            <w:r>
+              <w:t>StudentGrade.score compared with Assessment.total_score; Enrollment and Assessment must reference the same Class.</w:t>
+            </w:r>
+          </w:p>
+        </w:tc>
+        <w:tc>
+          <w:tcPr>
+            <w:tcW w:type="dxa" w:w="3557"/>
+            <w:vAlign w:val="top"/>
+            <w:shd w:fill="F0F7F1"/>
+          </w:tcPr>
+          <w:p>
+            <w:pPr>
+              <w:spacing w:after="100" w:before="60" w:line="247" w:lineRule="auto"/>
+            </w:pPr>
+            <w:r>
+              <w:t>score DECIMAL(6,2) NULL. Backend: nonnegative score, maximum-score limit, at most two decimal places, and same-class validation.</w:t>
+            </w:r>
+          </w:p>
+        </w:tc>
+      </w:tr>
+      <w:tr>
+        <w:trPr>
+          <w:cantSplit/>
+        </w:trPr>
+        <w:tc>
+          <w:tcPr>
+            <w:tcW w:type="dxa" w:w="720"/>
+            <w:vAlign w:val="top"/>
+          </w:tcPr>
+          <w:p>
+            <w:pPr>
+              <w:spacing w:after="100" w:before="60" w:line="247" w:lineRule="auto"/>
+            </w:pPr>
+            <w:r>
+              <w:t>9</w:t>
+            </w:r>
+          </w:p>
+        </w:tc>
+        <w:tc>
+          <w:tcPr>
+            <w:tcW w:type="dxa" w:w="3600"/>
+            <w:vAlign w:val="top"/>
+          </w:tcPr>
+          <w:p>
+            <w:pPr>
+              <w:spacing w:after="100" w:before="60" w:line="247" w:lineRule="auto"/>
+            </w:pPr>
+            <w:r>
+              <w:t>A student’s running grade must count only the assessments already graded, weighted in proportion to each other. Weights need not total 100 and terms need not be split 50/50.</w:t>
+            </w:r>
+          </w:p>
+        </w:tc>
+        <w:tc>
+          <w:tcPr>
+            <w:tcW w:type="dxa" w:w="2448"/>
+            <w:vAlign w:val="top"/>
+          </w:tcPr>
+          <w:p>
+            <w:pPr>
+              <w:spacing w:after="100" w:before="60" w:line="247" w:lineRule="auto"/>
+            </w:pPr>
+            <w:r>
+              <w:t>Assessment.weight and StudentGrade.score feed Enrollment.running_grade.</w:t>
+            </w:r>
+          </w:p>
+        </w:tc>
+        <w:tc>
+          <w:tcPr>
+            <w:tcW w:type="dxa" w:w="3557"/>
+            <w:vAlign w:val="top"/>
+          </w:tcPr>
+          <w:p>
+            <w:pPr>
+              <w:spacing w:after="100" w:before="60" w:line="247" w:lineRule="auto"/>
+            </w:pPr>
+            <w:r>
+              <w:t>Backend: [sum(score / max x weight) / sum(graded weights)] x 100. Include recorded zero; exclude ungraded items. NULL if no qualifying graded assessment exists.</w:t>
+            </w:r>
+          </w:p>
+        </w:tc>
+      </w:tr>
+      <w:tr>
+        <w:trPr>
+          <w:cantSplit/>
+        </w:trPr>
+        <w:tc>
+          <w:tcPr>
+            <w:tcW w:type="dxa" w:w="720"/>
+            <w:vAlign w:val="top"/>
+            <w:shd w:fill="F0F7F1"/>
+          </w:tcPr>
+          <w:p>
+            <w:pPr>
+              <w:spacing w:after="100" w:before="60" w:line="247" w:lineRule="auto"/>
+            </w:pPr>
+            <w:r>
+              <w:t>10</w:t>
+            </w:r>
+          </w:p>
+        </w:tc>
+        <w:tc>
+          <w:tcPr>
+            <w:tcW w:type="dxa" w:w="3600"/>
+            <w:vAlign w:val="top"/>
+            <w:shd w:fill="F0F7F1"/>
+          </w:tcPr>
+          <w:p>
+            <w:pPr>
+              <w:spacing w:after="100" w:before="60" w:line="247" w:lineRule="auto"/>
+            </w:pPr>
+            <w:r>
+              <w:t>A student is Passed at a running grade of 75% or higher and At risk below 75%. Until something is graded, the student is Not Yet.</w:t>
+            </w:r>
+          </w:p>
+        </w:tc>
+        <w:tc>
+          <w:tcPr>
+            <w:tcW w:type="dxa" w:w="2448"/>
+            <w:vAlign w:val="top"/>
+            <w:shd w:fill="F0F7F1"/>
+          </w:tcPr>
+          <w:p>
+            <w:pPr>
+              <w:spacing w:after="100" w:before="60" w:line="247" w:lineRule="auto"/>
+            </w:pPr>
+            <w:r>
+              <w:t>Enrollment.running_grade.</w:t>
+            </w:r>
+          </w:p>
+        </w:tc>
+        <w:tc>
+          <w:tcPr>
+            <w:tcW w:type="dxa" w:w="3557"/>
+            <w:vAlign w:val="top"/>
+            <w:shd w:fill="F0F7F1"/>
+          </w:tcPr>
+          <w:p>
+            <w:pPr>
+              <w:spacing w:after="100" w:before="60" w:line="247" w:lineRule="auto"/>
+            </w:pPr>
+            <w:r>
+              <w:t>running_grade DECIMAL(5,2) NULL. Backend: recalculation and standing; passing threshold 75%.</w:t>
+            </w:r>
+          </w:p>
+        </w:tc>
+      </w:tr>
+      <w:tr>
+        <w:trPr>
+          <w:cantSplit/>
+        </w:trPr>
+        <w:tc>
+          <w:tcPr>
+            <w:tcW w:type="dxa" w:w="720"/>
+            <w:vAlign w:val="top"/>
+          </w:tcPr>
+          <w:p>
+            <w:pPr>
+              <w:spacing w:after="100" w:before="60" w:line="247" w:lineRule="auto"/>
+            </w:pPr>
+            <w:r>
+              <w:t>11</w:t>
+            </w:r>
+          </w:p>
+        </w:tc>
+        <w:tc>
+          <w:tcPr>
+            <w:tcW w:type="dxa" w:w="3600"/>
+            <w:vAlign w:val="top"/>
+          </w:tcPr>
+          <w:p>
+            <w:pPr>
+              <w:spacing w:after="100" w:before="60" w:line="247" w:lineRule="auto"/>
+            </w:pPr>
+            <w:r>
+              <w:t>A student may ask for a re-check or a point increase only on their own graded assessment. A grade may have only one open request at a time.</w:t>
+            </w:r>
+          </w:p>
+        </w:tc>
+        <w:tc>
+          <w:tcPr>
+            <w:tcW w:type="dxa" w:w="2448"/>
+            <w:vAlign w:val="top"/>
+          </w:tcPr>
+          <w:p>
+            <w:pPr>
+              <w:spacing w:after="100" w:before="60" w:line="247" w:lineRule="auto"/>
+            </w:pPr>
+            <w:r>
+              <w:t>StudentGrade 1 to many RevisionRequest.</w:t>
+            </w:r>
+          </w:p>
+        </w:tc>
+        <w:tc>
+          <w:tcPr>
+            <w:tcW w:type="dxa" w:w="3557"/>
+            <w:vAlign w:val="top"/>
+          </w:tcPr>
+          <w:p>
+            <w:pPr>
+              <w:spacing w:after="100" w:before="60" w:line="247" w:lineRule="auto"/>
+            </w:pPr>
+            <w:r>
+              <w:t>FOREIGN KEY grade_id ON DELETE CASCADE. reason NOT NULL. requested_points NULL means re-check. Backend: ownership, graded assessment, positive requested points with at most two decimal places, and one open request (Pending or Under Review).</w:t>
+            </w:r>
+          </w:p>
+        </w:tc>
+      </w:tr>
+      <w:tr>
+        <w:trPr>
+          <w:cantSplit/>
+        </w:trPr>
+        <w:tc>
+          <w:tcPr>
+            <w:tcW w:type="dxa" w:w="720"/>
+            <w:vAlign w:val="top"/>
+            <w:shd w:fill="F0F7F1"/>
+          </w:tcPr>
+          <w:p>
+            <w:pPr>
+              <w:spacing w:after="100" w:before="60" w:line="247" w:lineRule="auto"/>
+            </w:pPr>
+            <w:r>
+              <w:t>12</w:t>
+            </w:r>
+          </w:p>
+        </w:tc>
+        <w:tc>
+          <w:tcPr>
+            <w:tcW w:type="dxa" w:w="3600"/>
+            <w:vAlign w:val="top"/>
+            <w:shd w:fill="F0F7F1"/>
+          </w:tcPr>
+          <w:p>
+            <w:pPr>
+              <w:spacing w:after="100" w:before="60" w:line="247" w:lineRule="auto"/>
+            </w:pPr>
+            <w:r>
+              <w:t>A new request starts as Pending. Only the class’s assigned active teacher may mark it Under Review, approve it or close it. Under Review is optional. The reviewer and review time must be recorded when the request is Approved or Closed. Marking a request Under Review must be recorded in the audit log but does not set the reviewer and review-time fields. A request that is Approved or Closed must not be processed again.</w:t>
+            </w:r>
+          </w:p>
+        </w:tc>
+        <w:tc>
+          <w:tcPr>
+            <w:tcW w:type="dxa" w:w="2448"/>
+            <w:vAlign w:val="top"/>
+            <w:shd w:fill="F0F7F1"/>
+          </w:tcPr>
+          <w:p>
+            <w:pPr>
+              <w:spacing w:after="100" w:before="60" w:line="247" w:lineRule="auto"/>
+            </w:pPr>
+            <w:r>
+              <w:t>RevisionRequest.status. Teacher 0 or 1 to many RevisionRequest. Review actions are also recorded in AuditLog.</w:t>
+            </w:r>
+          </w:p>
+        </w:tc>
+        <w:tc>
+          <w:tcPr>
+            <w:tcW w:type="dxa" w:w="3557"/>
+            <w:vAlign w:val="top"/>
+            <w:shd w:fill="F0F7F1"/>
+          </w:tcPr>
+          <w:p>
+            <w:pPr>
+              <w:spacing w:after="100" w:before="60" w:line="247" w:lineRule="auto"/>
+            </w:pPr>
+            <w:r>
+              <w:t>status ENUM('Pending','Under Review','Approved','Closed') DEFAULT 'Pending'. reviewed_by FOREIGN KEY ON DELETE SET NULL. Backend: populate reviewed_by and reviewed_at on approval or closure; log Under Review in AuditLog; enforce ownership, active teacher and terminal-state protection.</w:t>
+            </w:r>
+          </w:p>
+        </w:tc>
+      </w:tr>
+      <w:tr>
+        <w:trPr>
+          <w:cantSplit/>
+        </w:trPr>
+        <w:tc>
+          <w:tcPr>
+            <w:tcW w:type="dxa" w:w="720"/>
+            <w:vAlign w:val="top"/>
+          </w:tcPr>
+          <w:p>
+            <w:pPr>
+              <w:spacing w:after="100" w:before="60" w:line="247" w:lineRule="auto"/>
+            </w:pPr>
+            <w:r>
+              <w:t>13</w:t>
+            </w:r>
+          </w:p>
+        </w:tc>
+        <w:tc>
+          <w:tcPr>
+            <w:tcW w:type="dxa" w:w="3600"/>
+            <w:vAlign w:val="top"/>
+          </w:tcPr>
+          <w:p>
+            <w:pPr>
+              <w:spacing w:after="100" w:before="60" w:line="247" w:lineRule="auto"/>
+            </w:pPr>
+            <w:r>
+              <w:t>Only an active teacher assigned to a class may record scores and decide revision requests for it. Authorized admins may also record scores, but request decisions stay with the assigned teacher.</w:t>
+            </w:r>
+          </w:p>
+        </w:tc>
+        <w:tc>
+          <w:tcPr>
+            <w:tcW w:type="dxa" w:w="2448"/>
+            <w:vAlign w:val="top"/>
+          </w:tcPr>
+          <w:p>
+            <w:pPr>
+              <w:spacing w:after="100" w:before="60" w:line="247" w:lineRule="auto"/>
+            </w:pPr>
+            <w:r>
+              <w:t>Class.teacher_id and Teacher.status; authorized Admin grade-entry workflow.</w:t>
+            </w:r>
+          </w:p>
+        </w:tc>
+        <w:tc>
+          <w:tcPr>
+            <w:tcW w:type="dxa" w:w="3557"/>
+            <w:vAlign w:val="top"/>
+          </w:tcPr>
+          <w:p>
+            <w:pPr>
+              <w:spacing w:after="100" w:before="60" w:line="247" w:lineRule="auto"/>
+            </w:pPr>
+            <w:r>
+              <w:t>Backend: active assigned-teacher authorization for grading and request decisions; authorized admin access for administrative score entry.</w:t>
+            </w:r>
+          </w:p>
+        </w:tc>
+      </w:tr>
+      <w:tr>
+        <w:trPr>
+          <w:cantSplit/>
+        </w:trPr>
+        <w:tc>
+          <w:tcPr>
+            <w:tcW w:type="dxa" w:w="720"/>
+            <w:vAlign w:val="top"/>
+            <w:shd w:fill="F0F7F1"/>
+          </w:tcPr>
+          <w:p>
+            <w:pPr>
+              <w:spacing w:after="100" w:before="60" w:line="247" w:lineRule="auto"/>
+            </w:pPr>
+            <w:r>
+              <w:t>14</w:t>
+            </w:r>
+          </w:p>
+        </w:tc>
+        <w:tc>
+          <w:tcPr>
+            <w:tcW w:type="dxa" w:w="3600"/>
+            <w:vAlign w:val="top"/>
+            <w:shd w:fill="F0F7F1"/>
+          </w:tcPr>
+          <w:p>
+            <w:pPr>
+              <w:spacing w:after="100" w:before="60" w:line="247" w:lineRule="auto"/>
+            </w:pPr>
+            <w:r>
+              <w:t>Every important action must be logged with who did it (exactly one person: a student, teacher or admin), and with the old and new values when a score changes.</w:t>
+            </w:r>
+          </w:p>
+        </w:tc>
+        <w:tc>
+          <w:tcPr>
+            <w:tcW w:type="dxa" w:w="2448"/>
+            <w:vAlign w:val="top"/>
+            <w:shd w:fill="F0F7F1"/>
+          </w:tcPr>
+          <w:p>
+            <w:pPr>
+              <w:spacing w:after="100" w:before="60" w:line="247" w:lineRule="auto"/>
+            </w:pPr>
+            <w:r>
+              <w:t>AuditLog references Student, Teacher and Admin.</w:t>
+            </w:r>
+          </w:p>
+        </w:tc>
+        <w:tc>
+          <w:tcPr>
+            <w:tcW w:type="dxa" w:w="3557"/>
+            <w:vAlign w:val="top"/>
+            <w:shd w:fill="F0F7F1"/>
+          </w:tcPr>
+          <w:p>
+            <w:pPr>
+              <w:spacing w:after="100" w:before="60" w:line="247" w:lineRule="auto"/>
+            </w:pPr>
+            <w:r>
+              <w:t>FOREIGN KEYS for actors ON DELETE RESTRICT. CHECK chk_audit_one_actor. logged_at DEFAULT CURRENT_TIMESTAMP. Old/new values are recorded where applicable; a first recorded score may have no old value.</w:t>
+            </w:r>
+          </w:p>
+        </w:tc>
+      </w:tr>
+      <w:tr>
+        <w:trPr>
+          <w:cantSplit/>
+        </w:trPr>
+        <w:tc>
+          <w:tcPr>
+            <w:tcW w:type="dxa" w:w="720"/>
+            <w:vAlign w:val="top"/>
+          </w:tcPr>
+          <w:p>
+            <w:pPr>
+              <w:spacing w:after="100" w:before="60" w:line="247" w:lineRule="auto"/>
+            </w:pPr>
+            <w:r>
+              <w:t>15</w:t>
+            </w:r>
+          </w:p>
+        </w:tc>
+        <w:tc>
+          <w:tcPr>
+            <w:tcW w:type="dxa" w:w="3600"/>
+            <w:vAlign w:val="top"/>
+          </w:tcPr>
+          <w:p>
+            <w:pPr>
+              <w:spacing w:after="100" w:before="60" w:line="247" w:lineRule="auto"/>
+            </w:pPr>
+            <w:r>
+              <w:t>The history of an action must be kept even after the record it refers to is deleted.</w:t>
+            </w:r>
+          </w:p>
+        </w:tc>
+        <w:tc>
+          <w:tcPr>
+            <w:tcW w:type="dxa" w:w="2448"/>
+            <w:vAlign w:val="top"/>
+          </w:tcPr>
+          <w:p>
+            <w:pPr>
+              <w:spacing w:after="100" w:before="60" w:line="247" w:lineRule="auto"/>
+            </w:pPr>
+            <w:r>
+              <w:t>entity_type and entity_id are not foreign keys.</w:t>
+            </w:r>
+          </w:p>
+        </w:tc>
+        <w:tc>
+          <w:tcPr>
+            <w:tcW w:type="dxa" w:w="3557"/>
+            <w:vAlign w:val="top"/>
+          </w:tcPr>
+          <w:p>
+            <w:pPr>
+              <w:spacing w:after="100" w:before="60" w:line="247" w:lineRule="auto"/>
+            </w:pPr>
+            <w:r>
+              <w:t>NOT NULL entity_type and entity_id. INDEX idx_entity (entity_type, entity_id). Target references do not cascade-delete audit entries.</w:t>
+            </w:r>
+          </w:p>
+        </w:tc>
+      </w:tr>
+      <w:tr>
+        <w:trPr>
+          <w:cantSplit/>
+        </w:trPr>
+        <w:tc>
+          <w:tcPr>
+            <w:tcW w:type="dxa" w:w="720"/>
+            <w:vAlign w:val="top"/>
+            <w:shd w:fill="F0F7F1"/>
+          </w:tcPr>
+          <w:p>
+            <w:pPr>
+              <w:spacing w:after="100" w:before="60" w:line="247" w:lineRule="auto"/>
+            </w:pPr>
+            <w:r>
+              <w:t>16</w:t>
+            </w:r>
+          </w:p>
+        </w:tc>
+        <w:tc>
+          <w:tcPr>
+            <w:tcW w:type="dxa" w:w="3600"/>
+            <w:vAlign w:val="top"/>
+            <w:shd w:fill="F0F7F1"/>
+          </w:tcPr>
+          <w:p>
+            <w:pPr>
+              <w:spacing w:after="100" w:before="60" w:line="247" w:lineRule="auto"/>
+            </w:pPr>
+            <w:r>
+              <w:t>A teacher or course with classes, a student or class with enrollments, or an account referenced as an audit actor must not be deleted while those protected references remain. Where deletion is permitted, related records must follow the database’s defined deletion rules. Deleting an enrollment or assessment must also remove its related grades and the revision requests associated with those grades.</w:t>
+            </w:r>
+          </w:p>
+        </w:tc>
+        <w:tc>
+          <w:tcPr>
+            <w:tcW w:type="dxa" w:w="2448"/>
+            <w:vAlign w:val="top"/>
+            <w:shd w:fill="F0F7F1"/>
+          </w:tcPr>
+          <w:p>
+            <w:pPr>
+              <w:spacing w:after="100" w:before="60" w:line="247" w:lineRule="auto"/>
+            </w:pPr>
+            <w:r>
+              <w:t>Protects history through restrictive references and defined cascading relationships.</w:t>
+            </w:r>
+          </w:p>
+        </w:tc>
+        <w:tc>
+          <w:tcPr>
+            <w:tcW w:type="dxa" w:w="3557"/>
+            <w:vAlign w:val="top"/>
+            <w:shd w:fill="F0F7F1"/>
+          </w:tcPr>
+          <w:p>
+            <w:pPr>
+              <w:spacing w:after="100" w:before="60" w:line="247" w:lineRule="auto"/>
+            </w:pPr>
+            <w:r>
+              <w:t>RESTRICT on protected Class, Enrollment and audit-actor references. CASCADE from Enrollment or Assessment to StudentGrade, then from StudentGrade to RevisionRequest. SET NULL on RevisionRequest.reviewed_by as defined in the schema.</w:t>
+            </w:r>
+          </w:p>
+        </w:tc>
+      </w:tr>
+      <w:tr>
+        <w:trPr>
+          <w:cantSplit/>
+        </w:trPr>
+        <w:tc>
+          <w:tcPr>
+            <w:tcW w:type="dxa" w:w="720"/>
+            <w:vAlign w:val="top"/>
+          </w:tcPr>
+          <w:p>
+            <w:pPr>
+              <w:spacing w:after="100" w:before="60" w:line="247" w:lineRule="auto"/>
+            </w:pPr>
+            <w:r>
+              <w:t>17</w:t>
+            </w:r>
+          </w:p>
+        </w:tc>
+        <w:tc>
+          <w:tcPr>
+            <w:tcW w:type="dxa" w:w="3600"/>
+            <w:vAlign w:val="top"/>
+          </w:tcPr>
+          <w:p>
+            <w:pPr>
+              <w:spacing w:after="100" w:before="60" w:line="247" w:lineRule="auto"/>
+            </w:pPr>
+            <w:r>
+              <w:t>Each user may see and do only what their role allows: students see their own grades and requests, teachers see their assigned classes, and admins manage accounts. Role, ownership and account status must be checked before any protected action.</w:t>
+            </w:r>
+          </w:p>
+        </w:tc>
+        <w:tc>
+          <w:tcPr>
+            <w:tcW w:type="dxa" w:w="2448"/>
+            <w:vAlign w:val="top"/>
+          </w:tcPr>
+          <w:p>
+            <w:pPr>
+              <w:spacing w:after="100" w:before="60" w:line="247" w:lineRule="auto"/>
+            </w:pPr>
+            <w:r>
+              <w:t>Role-based screens and protected service operations.</w:t>
+            </w:r>
+          </w:p>
+        </w:tc>
+        <w:tc>
+          <w:tcPr>
+            <w:tcW w:type="dxa" w:w="3557"/>
+            <w:vAlign w:val="top"/>
+          </w:tcPr>
+          <w:p>
+            <w:pPr>
+              <w:spacing w:after="100" w:before="60" w:line="247" w:lineRule="auto"/>
+            </w:pPr>
+            <w:r>
+              <w:t>Backend: applicable role, ownership and account-status validation before protected actions.</w:t>
+            </w:r>
+          </w:p>
+        </w:tc>
+      </w:tr>
+    </w:tbl>
     <w:sectPr>
       <w:headerReference w:type="default" r:id="rId9"/>
       <w:footerReference w:type="default" r:id="rId10"/>
       <w:pgSz w:w="11909" w:h="16834"/>
-      <w:pgMar w:top="1008" w:right="1152" w:bottom="1008" w:left="1152" w:header="720" w:footer="720" w:gutter="0"/>
+      <w:pgMar w:top="864" w:right="792" w:bottom="864" w:left="792" w:header="720" w:footer="720" w:gutter="0"/>
       <w:cols w:space="720"/>
       <w:docGrid w:linePitch="360"/>
     </w:sectPr>
@@ -279,7 +1186,7 @@
     </w:pPr>
     <w:r>
       <w:rPr>
-        <w:sz w:val="18"/>
+        <w:sz w:val="16"/>
       </w:rPr>
       <w:t xml:space="preserve">Narrative Business Rules | Page </w:t>
     </w:r>
@@ -296,8 +1203,7 @@
     </w:pPr>
     <w:r>
       <w:rPr>
-        <w:color w:val="006400"/>
-        <w:sz w:val="18"/>
+        <w:sz w:val="16"/>
       </w:rPr>
       <w:t>THE DAUNTLESS GRADING SYSTEM</w:t>
     </w:r>
@@ -669,11 +1575,11 @@
     <w:qFormat/>
     <w:rsid w:val="00FC693F"/>
     <w:pPr>
-      <w:spacing w:line="259" w:lineRule="auto" w:after="200"/>
+      <w:spacing w:after="100"/>
     </w:pPr>
     <w:rPr>
       <w:rFonts w:ascii="Times New Roman" w:hAnsi="Times New Roman"/>
-      <w:sz w:val="22"/>
+      <w:sz w:val="20"/>
     </w:rPr>
   </w:style>
   <w:style w:type="paragraph" w:styleId="Header">

</xml_diff>

<commit_message>
Make business rules concise while preserving four-column format
</commit_message>
<xml_diff>
--- a/docs/Final_Revised_Business_Rules.docx
+++ b/docs/Final_Revised_Business_Rules.docx
@@ -123,7 +123,7 @@
               <w:spacing w:after="100" w:before="60" w:line="247" w:lineRule="auto"/>
             </w:pPr>
             <w:r>
-              <w:t>Every student, teacher and admin must have their own account with a unique ID. Two accounts of the same role must not share an email, and passwords must never be stored in plain form.</w:t>
+              <w:t>Each student, teacher and admin must have a unique account ID. Emails must be unique within each role, and passwords must be stored as hashes.</w:t>
             </w:r>
           </w:p>
         </w:tc>
@@ -151,7 +151,7 @@
               <w:spacing w:after="100" w:before="60" w:line="247" w:lineRule="auto"/>
             </w:pPr>
             <w:r>
-              <w:t>PRIMARY KEY on each account ID. UNIQUE email within each role table. NOT NULL password_hash. Backend: password hashing.</w:t>
+              <w:t>PRIMARY KEY; per-table UNIQUE email; NOT NULL password_hash. Backend: hashing.</w:t>
             </w:r>
           </w:p>
         </w:tc>
@@ -186,7 +186,7 @@
               <w:spacing w:after="100" w:before="60" w:line="247" w:lineRule="auto"/>
             </w:pPr>
             <w:r>
-              <w:t>A student or teacher account that has protected related records, such as enrollments, assigned classes, reviewer references or audit entries, must not be deleted. These accounts may be deactivated to restrict access while preserving their records. Only an account with no blocking related records may be deleted, and only by an admin.</w:t>
+              <w:t>Only admins may delete accounts without protected related records. Linked accounts may be deactivated instead.</w:t>
             </w:r>
           </w:p>
         </w:tc>
@@ -201,7 +201,7 @@
               <w:spacing w:after="100" w:before="60" w:line="247" w:lineRule="auto"/>
             </w:pPr>
             <w:r>
-              <w:t>status on Student and Teacher. Account deletion depends on protected related records.</w:t>
+              <w:t>Student.status; Teacher.status; linked records.</w:t>
             </w:r>
           </w:p>
         </w:tc>
@@ -216,7 +216,7 @@
               <w:spacing w:after="100" w:before="60" w:line="247" w:lineRule="auto"/>
             </w:pPr>
             <w:r>
-              <w:t>status ENUM('Active','Inactive') NOT NULL DEFAULT 'Active'. Restrictive foreign keys protect linked records. Backend: admin authorization and linked-record checks, including reviewer references.</w:t>
+              <w:t>Active/Inactive status; restrictive foreign keys. Backend: admin and linked-record checks.</w:t>
             </w:r>
           </w:p>
         </w:tc>
@@ -249,7 +249,7 @@
               <w:spacing w:after="100" w:before="60" w:line="247" w:lineRule="auto"/>
             </w:pPr>
             <w:r>
-              <w:t>A course may be offered in many classes. A course that has classes must not be deleted.</w:t>
+              <w:t>A course may have many classes and must not be deleted while classes reference it.</w:t>
             </w:r>
           </w:p>
         </w:tc>
@@ -263,7 +263,7 @@
               <w:spacing w:after="100" w:before="60" w:line="247" w:lineRule="auto"/>
             </w:pPr>
             <w:r>
-              <w:t>Course 1 to many Class.</w:t>
+              <w:t>Course 1:M Class.</w:t>
             </w:r>
           </w:p>
         </w:tc>
@@ -277,7 +277,7 @@
               <w:spacing w:after="100" w:before="60" w:line="247" w:lineRule="auto"/>
             </w:pPr>
             <w:r>
-              <w:t>PRIMARY KEY course_code. FOREIGN KEY Class.course_code, ON DELETE RESTRICT.</w:t>
+              <w:t>FOREIGN KEY course_code; ON DELETE RESTRICT.</w:t>
             </w:r>
           </w:p>
         </w:tc>
@@ -312,7 +312,7 @@
               <w:spacing w:after="100" w:before="60" w:line="247" w:lineRule="auto"/>
             </w:pPr>
             <w:r>
-              <w:t>Every class is one offering of a course for a section, semester and academic year, and must have exactly one teacher. The same offering must not be created twice. A teacher may handle many classes.</w:t>
+              <w:t>Each class must have one teacher and a unique course, section, semester and academic year combination.</w:t>
             </w:r>
           </w:p>
         </w:tc>
@@ -327,7 +327,7 @@
               <w:spacing w:after="100" w:before="60" w:line="247" w:lineRule="auto"/>
             </w:pPr>
             <w:r>
-              <w:t>Teacher 1 to many Class.</w:t>
+              <w:t>Teacher 1:M Class.</w:t>
             </w:r>
           </w:p>
         </w:tc>
@@ -342,7 +342,7 @@
               <w:spacing w:after="100" w:before="60" w:line="247" w:lineRule="auto"/>
             </w:pPr>
             <w:r>
-              <w:t>FOREIGN KEY teacher_id NOT NULL. UNIQUE uq_class (course_code, section, semester, academic_year).</w:t>
+              <w:t>NOT NULL teacher_id foreign key; UNIQUE(course_code, section, semester, academic_year).</w:t>
             </w:r>
           </w:p>
         </w:tc>
@@ -375,7 +375,7 @@
               <w:spacing w:after="100" w:before="60" w:line="247" w:lineRule="auto"/>
             </w:pPr>
             <w:r>
-              <w:t>A student may enroll in many classes, and a class may have many students. A student must not be enrolled in the same class twice.</w:t>
+              <w:t>A student may join many classes but must not enroll in the same class twice.</w:t>
             </w:r>
           </w:p>
         </w:tc>
@@ -389,7 +389,7 @@
               <w:spacing w:after="100" w:before="60" w:line="247" w:lineRule="auto"/>
             </w:pPr>
             <w:r>
-              <w:t>Many-to-many between Student and Class, resolved by Enrollment.</w:t>
+              <w:t>Student M:N Class through Enrollment.</w:t>
             </w:r>
           </w:p>
         </w:tc>
@@ -403,7 +403,7 @@
               <w:spacing w:after="100" w:before="60" w:line="247" w:lineRule="auto"/>
             </w:pPr>
             <w:r>
-              <w:t>FOREIGN KEYS student_id and class_id. UNIQUE uq_enrollment (student_id, class_id).</w:t>
+              <w:t>Foreign keys; UNIQUE(student_id, class_id).</w:t>
             </w:r>
           </w:p>
         </w:tc>
@@ -438,7 +438,7 @@
               <w:spacing w:after="100" w:before="60" w:line="247" w:lineRule="auto"/>
             </w:pPr>
             <w:r>
-              <w:t>Every assessment must belong to one class and one term (Midterm or Finals), and must have a type, a maximum score above zero and a weight.</w:t>
+              <w:t>Each assessment must belong to one class and term, with a valid type, positive maximum score and positive weight not exceeding 100.</w:t>
             </w:r>
           </w:p>
         </w:tc>
@@ -453,7 +453,7 @@
               <w:spacing w:after="100" w:before="60" w:line="247" w:lineRule="auto"/>
             </w:pPr>
             <w:r>
-              <w:t>Class 1 to many Assessment.</w:t>
+              <w:t>Class 1:M Assessment.</w:t>
             </w:r>
           </w:p>
         </w:tc>
@@ -468,7 +468,7 @@
               <w:spacing w:after="100" w:before="60" w:line="247" w:lineRule="auto"/>
             </w:pPr>
             <w:r>
-              <w:t>FOREIGN KEY class_id ON DELETE CASCADE. ENUM term and type. CHECK total_score &gt; 0. CHECK weight BETWEEN 0 AND 100. Backend: positive weight and at most two decimal places for maximum score and weight.</w:t>
+              <w:t>Class foreign key; term/type ENUMs; CHECK maximum &gt; 0, weight 0–100. Backend: weight &gt; 0; two-decimal limits.</w:t>
             </w:r>
           </w:p>
         </w:tc>
@@ -501,7 +501,7 @@
               <w:spacing w:after="100" w:before="60" w:line="247" w:lineRule="auto"/>
             </w:pPr>
             <w:r>
-              <w:t>A student must have no more than one grade for each assessment.</w:t>
+              <w:t>Each enrollment may have only one grade per assessment.</w:t>
             </w:r>
           </w:p>
         </w:tc>
@@ -515,7 +515,7 @@
               <w:spacing w:after="100" w:before="60" w:line="247" w:lineRule="auto"/>
             </w:pPr>
             <w:r>
-              <w:t>Many-to-many between Enrollment and Assessment, resolved by StudentGrade.</w:t>
+              <w:t>Enrollment and Assessment linked by StudentGrade.</w:t>
             </w:r>
           </w:p>
         </w:tc>
@@ -529,7 +529,7 @@
               <w:spacing w:after="100" w:before="60" w:line="247" w:lineRule="auto"/>
             </w:pPr>
             <w:r>
-              <w:t>FOREIGN KEYS enrollment_id and assessment_id. UNIQUE uq_grade (enrollment_id, assessment_id).</w:t>
+              <w:t>Foreign keys; UNIQUE(enrollment_id, assessment_id).</w:t>
             </w:r>
           </w:p>
         </w:tc>
@@ -564,7 +564,7 @@
               <w:spacing w:after="100" w:before="60" w:line="247" w:lineRule="auto"/>
             </w:pPr>
             <w:r>
-              <w:t>A score stays blank until the assessment is graded. A score must not be negative, must not exceed the assessment’s maximum, must have at most two decimal places, and may be recorded only for an assessment in the student’s own class.</w:t>
+              <w:t>Scores must remain blank until graded, fall between zero and the maximum, use at most two decimal places and match the enrollment’s class.</w:t>
             </w:r>
           </w:p>
         </w:tc>
@@ -579,7 +579,7 @@
               <w:spacing w:after="100" w:before="60" w:line="247" w:lineRule="auto"/>
             </w:pPr>
             <w:r>
-              <w:t>StudentGrade.score compared with Assessment.total_score; Enrollment and Assessment must reference the same Class.</w:t>
+              <w:t>StudentGrade, Enrollment and Assessment.</w:t>
             </w:r>
           </w:p>
         </w:tc>
@@ -594,7 +594,7 @@
               <w:spacing w:after="100" w:before="60" w:line="247" w:lineRule="auto"/>
             </w:pPr>
             <w:r>
-              <w:t>score DECIMAL(6,2) NULL. Backend: nonnegative score, maximum-score limit, at most two decimal places, and same-class validation.</w:t>
+              <w:t>Nullable DECIMAL(6,2). Backend: range, precision and same-class checks.</w:t>
             </w:r>
           </w:p>
         </w:tc>
@@ -627,7 +627,7 @@
               <w:spacing w:after="100" w:before="60" w:line="247" w:lineRule="auto"/>
             </w:pPr>
             <w:r>
-              <w:t>A student’s running grade must count only the assessments already graded, weighted in proportion to each other. Weights need not total 100 and terms need not be split 50/50.</w:t>
+              <w:t>Running grades must use relative weights of graded assessments only. Recorded zeros must count; ungraded items must not. Fixed totals or term splits are not required.</w:t>
             </w:r>
           </w:p>
         </w:tc>
@@ -641,7 +641,7 @@
               <w:spacing w:after="100" w:before="60" w:line="247" w:lineRule="auto"/>
             </w:pPr>
             <w:r>
-              <w:t>Assessment.weight and StudentGrade.score feed Enrollment.running_grade.</w:t>
+              <w:t>Assessment and StudentGrade → Enrollment.running_grade.</w:t>
             </w:r>
           </w:p>
         </w:tc>
@@ -655,7 +655,7 @@
               <w:spacing w:after="100" w:before="60" w:line="247" w:lineRule="auto"/>
             </w:pPr>
             <w:r>
-              <w:t>Backend: [sum(score / max x weight) / sum(graded weights)] x 100. Include recorded zero; exclude ungraded items. NULL if no qualifying graded assessment exists.</w:t>
+              <w:t>Backend: sum(score/max × weight) ÷ sum(graded weights) × 100; NULL if no qualifying grades.</w:t>
             </w:r>
           </w:p>
         </w:tc>
@@ -690,7 +690,7 @@
               <w:spacing w:after="100" w:before="60" w:line="247" w:lineRule="auto"/>
             </w:pPr>
             <w:r>
-              <w:t>A student is Passed at a running grade of 75% or higher and At risk below 75%. Until something is graded, the student is Not Yet.</w:t>
+              <w:t>A running grade of at least 75% is Passed; below 75% is At risk. No running grade is Not Yet.</w:t>
             </w:r>
           </w:p>
         </w:tc>
@@ -720,7 +720,7 @@
               <w:spacing w:after="100" w:before="60" w:line="247" w:lineRule="auto"/>
             </w:pPr>
             <w:r>
-              <w:t>running_grade DECIMAL(5,2) NULL. Backend: recalculation and standing; passing threshold 75%.</w:t>
+              <w:t>Nullable DECIMAL(5,2). Backend: shared calculator and 75% threshold.</w:t>
             </w:r>
           </w:p>
         </w:tc>
@@ -753,7 +753,7 @@
               <w:spacing w:after="100" w:before="60" w:line="247" w:lineRule="auto"/>
             </w:pPr>
             <w:r>
-              <w:t>A student may ask for a re-check or a point increase only on their own graded assessment. A grade may have only one open request at a time.</w:t>
+              <w:t>Students may request a re-check or point increase for their own graded assessments, with only one open request per grade.</w:t>
             </w:r>
           </w:p>
         </w:tc>
@@ -767,7 +767,7 @@
               <w:spacing w:after="100" w:before="60" w:line="247" w:lineRule="auto"/>
             </w:pPr>
             <w:r>
-              <w:t>StudentGrade 1 to many RevisionRequest.</w:t>
+              <w:t>StudentGrade 1:M RevisionRequest.</w:t>
             </w:r>
           </w:p>
         </w:tc>
@@ -781,7 +781,7 @@
               <w:spacing w:after="100" w:before="60" w:line="247" w:lineRule="auto"/>
             </w:pPr>
             <w:r>
-              <w:t>FOREIGN KEY grade_id ON DELETE CASCADE. reason NOT NULL. requested_points NULL means re-check. Backend: ownership, graded assessment, positive requested points with at most two decimal places, and one open request (Pending or Under Review).</w:t>
+              <w:t>Grade foreign key; reason required; NULL points = re-check. Backend: ownership, positive points and one Pending/Under Review request.</w:t>
             </w:r>
           </w:p>
         </w:tc>
@@ -816,7 +816,7 @@
               <w:spacing w:after="100" w:before="60" w:line="247" w:lineRule="auto"/>
             </w:pPr>
             <w:r>
-              <w:t>A new request starts as Pending. Only the class’s assigned active teacher may mark it Under Review, approve it or close it. Under Review is optional. The reviewer and review time must be recorded when the request is Approved or Closed. Marking a request Under Review must be recorded in the audit log but does not set the reviewer and review-time fields. A request that is Approved or Closed must not be processed again.</w:t>
+              <w:t>Requests must start Pending. The assigned active teacher may mark them Under Review, Approved or Closed. Approval or closure must record reviewer and time. Under Review must be audited. Final decisions must not be processed again.</w:t>
             </w:r>
           </w:p>
         </w:tc>
@@ -831,7 +831,7 @@
               <w:spacing w:after="100" w:before="60" w:line="247" w:lineRule="auto"/>
             </w:pPr>
             <w:r>
-              <w:t>RevisionRequest.status. Teacher 0 or 1 to many RevisionRequest. Review actions are also recorded in AuditLog.</w:t>
+              <w:t>RevisionRequest; Teacher; AuditLog.</w:t>
             </w:r>
           </w:p>
         </w:tc>
@@ -846,7 +846,7 @@
               <w:spacing w:after="100" w:before="60" w:line="247" w:lineRule="auto"/>
             </w:pPr>
             <w:r>
-              <w:t>status ENUM('Pending','Under Review','Approved','Closed') DEFAULT 'Pending'. reviewed_by FOREIGN KEY ON DELETE SET NULL. Backend: populate reviewed_by and reviewed_at on approval or closure; log Under Review in AuditLog; enforce ownership, active teacher and terminal-state protection.</w:t>
+              <w:t>Status ENUM. Backend: transition checks; reviewer/time on approval or closure; audit Under Review.</w:t>
             </w:r>
           </w:p>
         </w:tc>
@@ -879,7 +879,7 @@
               <w:spacing w:after="100" w:before="60" w:line="247" w:lineRule="auto"/>
             </w:pPr>
             <w:r>
-              <w:t>Only an active teacher assigned to a class may record scores and decide revision requests for it. Authorized admins may also record scores, but request decisions stay with the assigned teacher.</w:t>
+              <w:t>Assigned active teachers and authorized admins may record scores. Only the assigned active teacher may decide revision requests.</w:t>
             </w:r>
           </w:p>
         </w:tc>
@@ -893,7 +893,7 @@
               <w:spacing w:after="100" w:before="60" w:line="247" w:lineRule="auto"/>
             </w:pPr>
             <w:r>
-              <w:t>Class.teacher_id and Teacher.status; authorized Admin grade-entry workflow.</w:t>
+              <w:t>Class.teacher_id; Teacher.status; Admin.</w:t>
             </w:r>
           </w:p>
         </w:tc>
@@ -907,7 +907,7 @@
               <w:spacing w:after="100" w:before="60" w:line="247" w:lineRule="auto"/>
             </w:pPr>
             <w:r>
-              <w:t>Backend: active assigned-teacher authorization for grading and request decisions; authorized admin access for administrative score entry.</w:t>
+              <w:t>Backend: actor authorization, active teacher and class ownership.</w:t>
             </w:r>
           </w:p>
         </w:tc>
@@ -942,7 +942,7 @@
               <w:spacing w:after="100" w:before="60" w:line="247" w:lineRule="auto"/>
             </w:pPr>
             <w:r>
-              <w:t>Every important action must be logged with who did it (exactly one person: a student, teacher or admin), and with the old and new values when a score changes.</w:t>
+              <w:t>Important actions must be audited with one actor and a timestamp. Score changes must record available old and new values.</w:t>
             </w:r>
           </w:p>
         </w:tc>
@@ -957,7 +957,7 @@
               <w:spacing w:after="100" w:before="60" w:line="247" w:lineRule="auto"/>
             </w:pPr>
             <w:r>
-              <w:t>AuditLog references Student, Teacher and Admin.</w:t>
+              <w:t>AuditLog references one account actor.</w:t>
             </w:r>
           </w:p>
         </w:tc>
@@ -972,7 +972,7 @@
               <w:spacing w:after="100" w:before="60" w:line="247" w:lineRule="auto"/>
             </w:pPr>
             <w:r>
-              <w:t>FOREIGN KEYS for actors ON DELETE RESTRICT. CHECK chk_audit_one_actor. logged_at DEFAULT CURRENT_TIMESTAMP. Old/new values are recorded where applicable; a first recorded score may have no old value.</w:t>
+              <w:t>Actor foreign keys; CHECK exactly one actor; default timestamp; optional old/new values.</w:t>
             </w:r>
           </w:p>
         </w:tc>
@@ -1005,7 +1005,7 @@
               <w:spacing w:after="100" w:before="60" w:line="247" w:lineRule="auto"/>
             </w:pPr>
             <w:r>
-              <w:t>The history of an action must be kept even after the record it refers to is deleted.</w:t>
+              <w:t>Audit history must remain when its target record is deleted.</w:t>
             </w:r>
           </w:p>
         </w:tc>
@@ -1019,7 +1019,7 @@
               <w:spacing w:after="100" w:before="60" w:line="247" w:lineRule="auto"/>
             </w:pPr>
             <w:r>
-              <w:t>entity_type and entity_id are not foreign keys.</w:t>
+              <w:t>AuditLog.entity_type and entity_id.</w:t>
             </w:r>
           </w:p>
         </w:tc>
@@ -1033,7 +1033,7 @@
               <w:spacing w:after="100" w:before="60" w:line="247" w:lineRule="auto"/>
             </w:pPr>
             <w:r>
-              <w:t>NOT NULL entity_type and entity_id. INDEX idx_entity (entity_type, entity_id). Target references do not cascade-delete audit entries.</w:t>
+              <w:t>Entity fields are not foreign keys; INDEX(entity_type, entity_id).</w:t>
             </w:r>
           </w:p>
         </w:tc>
@@ -1068,7 +1068,7 @@
               <w:spacing w:after="100" w:before="60" w:line="247" w:lineRule="auto"/>
             </w:pPr>
             <w:r>
-              <w:t>A teacher or course with classes, a student or class with enrollments, or an account referenced as an audit actor must not be deleted while those protected references remain. Where deletion is permitted, related records must follow the database’s defined deletion rules. Deleting an enrollment or assessment must also remove its related grades and the revision requests associated with those grades.</w:t>
+              <w:t>Protected references must block deletion. Permitted deletions must follow defined cascade or null-setting rules.</w:t>
             </w:r>
           </w:p>
         </w:tc>
@@ -1083,7 +1083,7 @@
               <w:spacing w:after="100" w:before="60" w:line="247" w:lineRule="auto"/>
             </w:pPr>
             <w:r>
-              <w:t>Protects history through restrictive references and defined cascading relationships.</w:t>
+              <w:t>Class, Enrollment, StudentGrade, RevisionRequest and audit actors.</w:t>
             </w:r>
           </w:p>
         </w:tc>
@@ -1098,7 +1098,7 @@
               <w:spacing w:after="100" w:before="60" w:line="247" w:lineRule="auto"/>
             </w:pPr>
             <w:r>
-              <w:t>RESTRICT on protected Class, Enrollment and audit-actor references. CASCADE from Enrollment or Assessment to StudentGrade, then from StudentGrade to RevisionRequest. SET NULL on RevisionRequest.reviewed_by as defined in the schema.</w:t>
+              <w:t>RESTRICT protected links; CASCADE enrollment/assessment → grades → requests; SET NULL reviewed_by.</w:t>
             </w:r>
           </w:p>
         </w:tc>
@@ -1131,7 +1131,7 @@
               <w:spacing w:after="100" w:before="60" w:line="247" w:lineRule="auto"/>
             </w:pPr>
             <w:r>
-              <w:t>Each user may see and do only what their role allows: students see their own grades and requests, teachers see their assigned classes, and admins manage accounts. Role, ownership and account status must be checked before any protected action.</w:t>
+              <w:t>Users must access only role-authorized records and actions. Protected operations must validate applicable role, ownership and account status.</w:t>
             </w:r>
           </w:p>
         </w:tc>
@@ -1145,7 +1145,7 @@
               <w:spacing w:after="100" w:before="60" w:line="247" w:lineRule="auto"/>
             </w:pPr>
             <w:r>
-              <w:t>Role-based screens and protected service operations.</w:t>
+              <w:t>Role-based screens and service operations.</w:t>
             </w:r>
           </w:p>
         </w:tc>
@@ -1159,7 +1159,7 @@
               <w:spacing w:after="100" w:before="60" w:line="247" w:lineRule="auto"/>
             </w:pPr>
             <w:r>
-              <w:t>Backend: applicable role, ownership and account-status validation before protected actions.</w:t>
+              <w:t>Backend: applicable access and account-status checks.</w:t>
             </w:r>
           </w:p>
         </w:tc>

</xml_diff>